<commit_message>
Visual evidence pass: real plant records, verified clients, no repeated images
Integrates five photographed plant records (process-parameter record, FG
production records, bristling traceability report) into the flow,
registers and architecture slides, with annotations showing manual
consolidation and the same fact written twice. Adds a verified
contract-manufacturing client row to the JHS slide, removes every repeated
photograph, and adds image sources to speaker notes. Slide 12 and the
client row accept moulding/tufting photos and logos when supplied.
Slide count unchanged at 38.

Co-Authored-By: Claude Opus 5.5 <noreply@anthropic.com>
Claude-Session: https://claude.ai/code/session_01JVPf4Y68vS1p1pzLtGPCLX
</commit_message>
<xml_diff>
--- a/sip-presentation/SIP_Viva_Guide.docx
+++ b/sip-presentation/SIP_Viva_Guide.docx
@@ -9492,7 +9492,7 @@
           <w:sz w:val="22"/>
           <w:szCs w:val="22"/>
         </w:rPr>
-        <w:t xml:space="preserve">This is an actual photograph from the plant, a tube filling line, not a stock image.</w:t>
+        <w:t xml:space="preserve">This is an actual photograph from the plant, the yard between production blocks, not a stock image.</w:t>
       </w:r>
     </w:p>
     <w:p>
@@ -10988,7 +10988,7 @@
           <w:sz w:val="22"/>
           <w:szCs w:val="22"/>
         </w:rPr>
-        <w:t xml:space="preserve">Publicly, the company names clients such as Amway India and Dabur India in the domestic market. In my workbook, Amway, Chicco and Dabur are modelled as client accounts, but with fictional data.</w:t>
+        <w:t xml:space="preserve">Publicly reported clients include Dabur India, Patanjali Ayurved and Amway India; those are the three on the slide. The dashboard later in my deck uses Amway, Chicco and Dabur only as modelled accounts with fictional data, so I don't treat the demonstration data as evidence of who the clients are.</w:t>
       </w:r>
     </w:p>
     <w:p>
@@ -11100,7 +11100,7 @@
           <w:sz w:val="22"/>
           <w:szCs w:val="22"/>
         </w:rPr>
-        <w:t xml:space="preserve">These are photographs from the plant. On the left is the yard between production blocks, where material moves between stores, production and dispatch all day. Top right is a tube filling line in the paste plant: empty tubes come in from the hopper, then get filled, coded and sealed. Bottom right is the Kala-Amb industrial belt from the roof. Every one of these operations creates records: what was run, what material was used, what was rejected, when the machine stopped.</w:t>
+        <w:t xml:space="preserve">This is the view from the plant roof: production blocks, stores and utilities, with the Kala-Amb industrial belt and the hills behind. Stores, production, QC, packing and dispatch are spread across the campus, and material moves between them all day. Every one of those operations creates records: what was run, what material was used, what was rejected, when the machine stopped.</w:t>
       </w:r>
     </w:p>
     <w:p>
@@ -12026,7 +12026,7 @@
           <w:sz w:val="22"/>
           <w:szCs w:val="22"/>
         </w:rPr>
-        <w:t xml:space="preserve">This is the flow I mapped. Planning decides what to make. The warehouse receives and issues material. Production converts it, QC checks it, packing packs it, and dispatch sends it out. At every step, someone creates a record. So the plant isn't short of records. But these records were created by different people, in different formats, at different times. They didn't automatically join up into one story you could follow from a complaint back to a machine and a material lot.</w:t>
+        <w:t xml:space="preserve">This is the flow I mapped. Planning decides what to make. The warehouse receives and issues material. Production converts it, QC checks it, packing packs it, and dispatch sends it out. At every step, someone creates a record. At the bottom are two of them as they actually look: the process-parameter record filled at the bristling machines, and the finished-goods production record filled after packing. So the plant isn't short of records. But these records were created by different people, in different formats, at different times. They didn't automatically join up into one story you could follow from a complaint back to a machine and a material lot.</w:t>
       </w:r>
     </w:p>
     <w:p>
@@ -12139,6 +12139,36 @@
           <w:szCs w:val="22"/>
         </w:rPr>
         <w:t xml:space="preserve">By walking the process, talking to the people in each function, and looking at the registers and formats they actually filled in.</w:t>
+      </w:r>
+    </w:p>
+    <w:p>
+      <w:pPr>
+        <w:spacing w:after="40" w:before="0"/>
+      </w:pPr>
+      <w:r>
+        <w:rPr>
+          <w:rFonts w:ascii="Calibri" w:cs="Calibri" w:eastAsia="Calibri" w:hAnsi="Calibri"/>
+          <w:b/>
+          <w:bCs/>
+          <w:color w:val="1A1D21"/>
+          <w:sz w:val="22"/>
+          <w:szCs w:val="22"/>
+        </w:rPr>
+        <w:t xml:space="preserve">What are the two forms at the bottom?</w:t>
+      </w:r>
+    </w:p>
+    <w:p>
+      <w:pPr>
+        <w:spacing w:after="120" w:before="0"/>
+      </w:pPr>
+      <w:r>
+        <w:rPr>
+          <w:rFonts w:ascii="Calibri" w:cs="Calibri" w:eastAsia="Calibri" w:hAnsi="Calibri"/>
+          <w:color w:val="1A1D21"/>
+          <w:sz w:val="22"/>
+          <w:szCs w:val="22"/>
+        </w:rPr>
+        <w:t xml:space="preserve">Real plant formats. On the left, the bristling process-parameter record: speed and pressure for each tufting and trimming machine and the sealing temperatures, checked every shift. On the right, the FG production record: product, brushes per case, batch number and cases packed. They're filled by different people, at different points, on different sheets.</w:t>
       </w:r>
     </w:p>
     <w:p>
@@ -12414,7 +12444,7 @@
           <w:sz w:val="22"/>
           <w:szCs w:val="22"/>
         </w:rPr>
-        <w:t xml:space="preserve">These are the five kinds of record I kept coming back to: production, quality, material, downtime and dispatch. Each one made sense on its own. But to answer a question that crosses them, like our complaint, someone has to search each register manually, then consolidate what they find, usually by hand. That delays the investigation, and it means management only sees the full picture when someone has done that work. So the issue was structural. There was no common key and no automatic link between the registers.</w:t>
+        <w:t xml:space="preserve">These are real records from the bristling line. The first is the plant's own traceability report for Patanjali Triple Action, batch JBCA260003. Look at its headers: this column is 'data received from handle tag', this one 'from cap tag', these 'from shift production formats'. Someone builds this report by hand, from other records. And the same fact gets written twice. On 11 June, 25 cases of JBCA260003: once on the FG production record, and again in row 19 of the traceability report. The same page also shows one batch number running across several production days and colours, which is exactly why the batch number alone couldn't identify a run. Behind these are the five kinds of record I kept coming back to: production, quality, material, downtime and dispatch. Each one made sense on its own. But to answer a question that crosses them, like our complaint, someone has to search each register manually, then consolidate what they find, usually by hand. That delays the investigation, and it means management only sees the full picture when someone has done that work. So the issue was structural. There was no common key and no automatic link between the registers.</w:t>
       </w:r>
     </w:p>
     <w:p>
@@ -12478,7 +12508,7 @@
           <w:sz w:val="22"/>
           <w:szCs w:val="22"/>
         </w:rPr>
-        <w:t xml:space="preserve">The registers are deliberately drawn scattered, with nothing joining them. That's the problem in one picture.</w:t>
+        <w:t xml:space="preserve">Marker 2 appears on both records: the same fact, written by hand in two places. Nothing links them except a person copying it.</w:t>
       </w:r>
     </w:p>
     <w:p>
@@ -12526,7 +12556,37 @@
           <w:sz w:val="22"/>
           <w:szCs w:val="22"/>
         </w:rPr>
-        <w:t xml:space="preserve">Both. Each function kept its own departmental register or spreadsheet. The records were generally accurate. The issue was that they weren't connected to each other.</w:t>
+        <w:t xml:space="preserve">Both. Each function kept its own departmental register or spreadsheet. The records were generally accurate. The issue was that they weren't connected to each other. The two on this slide are paper formats, filled by hand and signed.</w:t>
+      </w:r>
+    </w:p>
+    <w:p>
+      <w:pPr>
+        <w:spacing w:after="40" w:before="0"/>
+      </w:pPr>
+      <w:r>
+        <w:rPr>
+          <w:rFonts w:ascii="Calibri" w:cs="Calibri" w:eastAsia="Calibri" w:hAnsi="Calibri"/>
+          <w:b/>
+          <w:bCs/>
+          <w:color w:val="1A1D21"/>
+          <w:sz w:val="22"/>
+          <w:szCs w:val="22"/>
+        </w:rPr>
+        <w:t xml:space="preserve">Why does one batch number cover several days?</w:t>
+      </w:r>
+    </w:p>
+    <w:p>
+      <w:pPr>
+        <w:spacing w:after="120" w:before="0"/>
+      </w:pPr>
+      <w:r>
+        <w:rPr>
+          <w:rFonts w:ascii="Calibri" w:cs="Calibri" w:eastAsia="Calibri" w:hAnsi="Calibri"/>
+          <w:color w:val="1A1D21"/>
+          <w:sz w:val="22"/>
+          <w:szCs w:val="22"/>
+        </w:rPr>
+        <w:t xml:space="preserve">On this line the batch JBCA260003 ran from 14 May to 13 June, across several production days, colours and handle lots. So a pack's batch number alone can't tell you which day, colour or handle lot you're looking at. That's the real-world version of what I showed with the demonstration data on slide 5.</w:t>
       </w:r>
     </w:p>
     <w:p>
@@ -13564,7 +13624,7 @@
           <w:sz w:val="22"/>
           <w:szCs w:val="22"/>
         </w:rPr>
-        <w:t xml:space="preserve">I organised the workbook into five layers. Master data holds the reference lists: products, colours, machines, materials and ideal speeds. Transaction registers are where daily events are entered: production, quality, material issue, downtime and dispatch. The calculation layer joins and summarises those registers using formulas like SUMIFS, COUNTIFS and INDEX-MATCH. The presentation layer is what users see: dashboards, the trace report and the OEE view. Documentation explains how to use and maintain it. Data flows in one direction, from masters to registers to calculations to outputs.</w:t>
+        <w:t xml:space="preserve">I organised the workbook into five layers. Master data holds the reference lists: products, colours, machines, materials and ideal speeds. Transaction registers are where daily events are entered: production, quality, material issue, downtime and dispatch. The calculation layer joins and summarises those registers using formulas like SUMIFS, COUNTIFS and INDEX-MATCH. The presentation layer is what users see: dashboards, the trace report and the OEE view. Documentation explains how to use and maintain it. Data flows in one direction, from masters to registers to calculations to outputs. Bottom right is the plant's own paper traceability report. I used its columns, like handle lot, nylon and brass-wire lots, packing materials and machines, as the fields in my registers, so the system records what the plant already tracks.</w:t>
       </w:r>
     </w:p>
     <w:p>

</xml_diff>